<commit_message>
staj: bitirme önerisinde tahsisat etkileşimi sorusu netleştirildi
Co-Authored-By: Claude Opus 5.5 <noreply@anthropic.com>
Claude-Session: https://claude.ai/code/session_013mfV4QxXq7Pn1yYJ9Ag6sX
</commit_message>
<xml_diff>
--- a/staj/bitirme/Bitirme-Projesi-Onerisi.docx
+++ b/staj/bitirme/Bitirme-Projesi-Onerisi.docx
@@ -428,7 +428,7 @@
           <w:sz w:val="24"/>
           <w:szCs w:val="24"/>
         </w:rPr>
-        <w:t xml:space="preserve">Yakıt tasarrufu sağlayan bir verimlilik önlemi, ısı ve yakıt alt tesislerinde faaliyet seviyesini düşürerek ücretsiz tahsisatı ne ölçüde azaltır; bu durum verimlilik yatırımı için ters bir teşvik oluşturur mu?</w:t>
+        <w:t xml:space="preserve">Kıyas değeri, ücretsiz tahsisat oranı ve sektörel katsayı tüm tesisler için ortak olmakla birlikte faaliyet seviyesi tesise özgüdür (m. 13/5, 13/7). Isı ve yakıt kıyasına dayalı alt tesislerde verimlilik önlemi faaliyet seviyesini de düşürdüğünde, önlemin karbon getirisinin ne kadarı ücretsiz tahsisat azalmasıyla dengelenir ve bu oran alt tesis türüne ve yakıt cinsine göre nasıl değişir?</w:t>
       </w:r>
     </w:p>
     <w:p>
@@ -477,7 +477,7 @@
           <w:sz w:val="24"/>
           <w:szCs w:val="24"/>
         </w:rPr>
-        <w:t xml:space="preserve">Yönetmeliğin yeni yürürlüğe girmiş olması nedeniyle, gerçek kategori eşikleri ve ücretsiz tahsisat formülü (m. 13/7) kullanılarak tesis düzeyinde yapılmış bir verimlilik değerlendirmesi ön taramada tespit edilmemiştir. Türkiye elektrik piyasasındaki arz sıralaması çalışmaları ağırlıklı olarak yenilenebilir enerjinin fiyat etkisine odaklanmaktadır. Karbon fiyatının PTF'ye saatlik geçişini gerçek piyasa verisiyle inceleyen bir çalışmaya ise rastlanmamıştır. Tahsisatın faaliyet seviyesine bağlanmasının davranışı bozabildiği AB ETS için gösterilmiştir (Branger vd., 2015). Ancak bu etkileşim, Türkiye'nin tahsisat formülü ve bir enerji verimliliği önlem paketi üzerinden çalışılmamıştır.</w:t>
+        <w:t xml:space="preserve">Yönetmeliğin yeni yürürlüğe girmiş olması nedeniyle, gerçek kategori eşikleri ve ücretsiz tahsisat formülü (m. 13/7) kullanılarak tesis düzeyinde yapılmış bir verimlilik değerlendirmesi ön taramada tespit edilmemiştir. Türkiye elektrik piyasasındaki arz sıralaması çalışmaları ağırlıklı olarak yenilenebilir enerjinin fiyat etkisine odaklanmaktadır. Karbon fiyatının PTF'ye saatlik geçişini gerçek piyasa verisiyle inceleyen bir çalışmaya ise rastlanmamıştır. Tahsisatın faaliyet seviyesine bağlanmasının işletme kararlarını etkileyebildiği AB ETS için gösterilmiştir (Branger vd., 2015). Türkiye'de faaliyet seviyesi her sistem yılı için güncellendiğinden (m. 13/5) bu etkileşim doğrudan ve aynı yıl içinde ortaya çıkar; ancak Türkiye'nin tahsisat formülü ve bir enerji verimliliği önlem paketi üzerinden çalışılmamıştır.</w:t>
       </w:r>
     </w:p>
     <w:p>
@@ -549,7 +549,7 @@
           <w:sz w:val="24"/>
           <w:szCs w:val="24"/>
         </w:rPr>
-        <w:t xml:space="preserve">(atık ısı geri kazanımı, kazan verimi, izolasyon) doğrudan emisyonu azaltır, ancak ücretsiz tahsisat kaybıyla bu değerin bir kısmını geri verebilir.</w:t>
+        <w:t xml:space="preserve">(atık ısı geri kazanımı, kazan verimi, izolasyon) doğrudan emisyonu azaltır. Isı veya yakıt kıyasına dayalı alt tesislerde ücretsiz tahsisat da azaldığından karbon getirisinin bir kısmı dengelenir; enerji maliyeti tasarrufu ise olduğu gibi kalır. Ürün kıyasına dayalı alt tesislerde bu dengelenme oluşmaz.</w:t>
       </w:r>
     </w:p>
     <w:p>
@@ -941,7 +941,7 @@
           <w:sz w:val="24"/>
           <w:szCs w:val="24"/>
         </w:rPr>
-        <w:t xml:space="preserve">Verimlilik yatırımı ile ücretsiz tahsisat arasındaki etkileşimin sayısal gösterimi ve politika önerisi</w:t>
+        <w:t xml:space="preserve">Alt tesis türüne göre verimlilik yatırımı ile ücretsiz tahsisat arasındaki etkileşimin sayısal gösterimi</w:t>
       </w:r>
     </w:p>
     <w:p>

</xml_diff>